<commit_message>
docs(scans): say a UPC keeps 12 or 13 digits
The comments on Barcodes.Classify and Scan.Code, and two lines in the
Project Overview, said every UPC is kept in 12-digit form. Only a
13-digit EAN that starts with 0 is shortened; any other EAN-13 keeps
all 13 digits (GEN-1). The Overview's date moves to Oct 23, 2026.

A new test checks that a UPC-E the scanner has expanded to UPC-A keeps
its leading 0. The UPC-E sample, whose check digit was wrong, is now a
real one: 04252614, which expands to 042100005264.

Co-Authored-By: Claude Opus 5.5 <noreply@anthropic.com>
</commit_message>
<xml_diff>
--- a/docs/Rewind - Project Overview.docx
+++ b/docs/Rewind - Project Overview.docx
@@ -13,7 +13,7 @@
     <w:p>
       <w:pPr/>
       <w:r>
-        <w:t xml:space="preserve">Oct 20, 2026</w:t>
+        <w:t xml:space="preserve">Oct 23, 2026</w:t>
       </w:r>
       <w:r>
         <w:t xml:space="preserve"> · </w:t>
@@ -2490,7 +2490,7 @@
     <w:p>
       <w:pPr/>
       <w:r>
-        <w:t xml:space="preserve">Labels are Code 128 on removable label sheets, printed from the Store Manager in numbered batches. A UPC names an edition, not a movie: a box set has one UPC for several movies, and each edition of a movie has its own UPC. So Rewind never checks out by UPC, but it saves each case's UPC for the phone catalog, in 12-digit form, because a 13-digit EAN that starts with 0 is the same product.</w:t>
+        <w:t xml:space="preserve">Labels are Code 128 on removable label sheets, printed from the Store Manager in numbered batches. A UPC names an edition, not a movie: a box set has one UPC for several movies, and each edition of a movie has its own UPC. So Rewind never checks out by UPC, but it saves each case's UPC for the phone catalog, as 12 or 13 digits: a 13-digit EAN that starts with 0 is the same product as a 12-digit UPC-A, so it's saved in that form.</w:t>
       </w:r>
     </w:p>
     <w:p>
@@ -4227,7 +4227,7 @@
           <w:p>
             <w:pPr/>
             <w:r>
-              <w:t xml:space="preserve">Change and count-back; the shuffle bag never hits twice in a row and draws once per business day; barcode types; UPCs stored as 12 digits; the spinner skips unknown runtimes and ratings when a cap is set</w:t>
+              <w:t xml:space="preserve">Change and count-back; the shuffle bag never hits twice in a row and draws once per business day; barcode types; a 13-digit EAN that starts with 0 stored as its 12-digit UPC-A; the spinner skips unknown runtimes and ratings when a cap is set</w:t>
             </w:r>
           </w:p>
         </w:tc>

</xml_diff>

<commit_message>
feat(labels): number sheets of store labels and member cards
Build Plan 2.5 keeps the next label number in StoreSettings, so
batches never repeat a number. StoreSettings gains
NextStoreLabelNumber and NextMemberCardNumber. The AddLabelNumbers
migration adds them with DEFAULT 1, so the register's row starts at
RV-00001 and MEM-001.

LabelSheets makes a sheet of 30 store labels or 10 member cards. In
one IMMEDIATE transaction it reads the counter, draws each code's
barcode with Code128, and saves the counter advanced past the sheet,
so a second sheet made at the same moment waits for the first to
commit. A sheet that would pass RV-99999 or MEM-999 comes back
OutOfNumbers and spends nothing. PeekAsync gives the codes the next
sheets start at.

ADR-0006 records why a sheet's numbers are spent when it's made,
before the print window opens. The Overview's data model lists the
two counters.

Co-Authored-By: Claude Opus 5.5 <noreply@anthropic.com>
</commit_message>
<xml_diff>
--- a/docs/Rewind - Project Overview.docx
+++ b/docs/Rewind - Project Overview.docx
@@ -13,7 +13,7 @@
     <w:p>
       <w:pPr/>
       <w:r>
-        <w:t xml:space="preserve">Oct 24, 2026</w:t>
+        <w:t xml:space="preserve">Oct 25, 2026</w:t>
       </w:r>
       <w:r>
         <w:t xml:space="preserve"> · </w:t>
@@ -2056,7 +2056,7 @@
           <w:p>
             <w:pPr/>
             <w:r>
-              <w:t xml:space="preserve">Rental price, late fee amount, store name</w:t>
+              <w:t xml:space="preserve">Rental price, late fee amount, store name, and the next store label and member card numbers</w:t>
             </w:r>
           </w:p>
         </w:tc>

</xml_diff>

<commit_message>
feat(labels): number sheets of store labels and member cards (#23)
Build Plan 2.5 keeps the next label number in StoreSettings, so
batches never repeat a number. StoreSettings gains
NextStoreLabelNumber and NextMemberCardNumber. The AddLabelNumbers
migration adds them with DEFAULT 1, so the register's row starts at
RV-00001 and MEM-001.

LabelSheets makes a sheet of 30 store labels or 10 member cards. In
one IMMEDIATE transaction it reads the counter, draws each code's
barcode with Code128, and saves the counter advanced past the sheet,
so a second sheet made at the same moment waits for the first to
commit. A sheet that would pass RV-99999 or MEM-999 comes back
OutOfNumbers and spends nothing. PeekAsync gives the codes the next
sheets start at.

ADR-0006 records why a sheet's numbers are spent when it's made,
before the print window opens. The Overview's data model lists the
two counters.

Co-Authored-By: Claude Opus 5.5 <noreply@anthropic.com>
</commit_message>
<xml_diff>
--- a/docs/Rewind - Project Overview.docx
+++ b/docs/Rewind - Project Overview.docx
@@ -13,7 +13,7 @@
     <w:p>
       <w:pPr/>
       <w:r>
-        <w:t xml:space="preserve">Oct 24, 2026</w:t>
+        <w:t xml:space="preserve">Oct 25, 2026</w:t>
       </w:r>
       <w:r>
         <w:t xml:space="preserve"> · </w:t>
@@ -2056,7 +2056,7 @@
           <w:p>
             <w:pPr/>
             <w:r>
-              <w:t xml:space="preserve">Rental price, late fee amount, store name</w:t>
+              <w:t xml:space="preserve">Rental price, late fee amount, store name, and the next store label and member card numbers</w:t>
             </w:r>
           </w:p>
         </w:tc>

</xml_diff>